<commit_message>
Auto Update Lottery Data
</commit_message>
<xml_diff>
--- a/最新開獎紀錄.docx
+++ b/最新開獎紀錄.docx
@@ -173,7 +173,7 @@
                 <w:b/>
                 <w:sz w:val="25"/>
               </w:rPr>
-              <w:t>115000207</w:t>
+              <w:t>115000208</w:t>
             </w:r>
           </w:p>
         </w:tc>
@@ -197,7 +197,7 @@
                 <w:b/>
                 <w:sz w:val="25"/>
               </w:rPr>
-              <w:t>115.08.26</w:t>
+              <w:t>115.08.27</w:t>
             </w:r>
           </w:p>
         </w:tc>
@@ -221,7 +221,7 @@
                 <w:b/>
                 <w:sz w:val="25"/>
               </w:rPr>
-              <w:t>13  19  23  35  38</w:t>
+              <w:t>02  03  07  25  33</w:t>
             </w:r>
           </w:p>
         </w:tc>
@@ -250,7 +250,7 @@
                 <w:b/>
                 <w:sz w:val="25"/>
               </w:rPr>
-              <w:t>115000208</w:t>
+              <w:t>115000209</w:t>
             </w:r>
           </w:p>
         </w:tc>
@@ -274,7 +274,7 @@
                 <w:b/>
                 <w:sz w:val="25"/>
               </w:rPr>
-              <w:t>115.08.27</w:t>
+              <w:t>115.08.28</w:t>
             </w:r>
           </w:p>
         </w:tc>
@@ -298,7 +298,7 @@
                 <w:b/>
                 <w:sz w:val="25"/>
               </w:rPr>
-              <w:t>02  03  07  25  33</w:t>
+              <w:t>02  04  09  12  36</w:t>
             </w:r>
           </w:p>
         </w:tc>
@@ -327,7 +327,7 @@
                 <w:b/>
                 <w:sz w:val="25"/>
               </w:rPr>
-              <w:t>115000209</w:t>
+              <w:t>115000210</w:t>
             </w:r>
           </w:p>
         </w:tc>
@@ -351,7 +351,7 @@
                 <w:b/>
                 <w:sz w:val="25"/>
               </w:rPr>
-              <w:t>115.08.28</w:t>
+              <w:t>115.08.29</w:t>
             </w:r>
           </w:p>
         </w:tc>
@@ -375,7 +375,7 @@
                 <w:b/>
                 <w:sz w:val="25"/>
               </w:rPr>
-              <w:t>02  04  09  12  36</w:t>
+              <w:t>03  06  17  23  33</w:t>
             </w:r>
           </w:p>
         </w:tc>
@@ -404,7 +404,7 @@
                 <w:b/>
                 <w:sz w:val="25"/>
               </w:rPr>
-              <w:t>115000210</w:t>
+              <w:t>115000211</w:t>
             </w:r>
           </w:p>
         </w:tc>
@@ -428,7 +428,7 @@
                 <w:b/>
                 <w:sz w:val="25"/>
               </w:rPr>
-              <w:t>115.08.29</w:t>
+              <w:t>115.08.31</w:t>
             </w:r>
           </w:p>
         </w:tc>
@@ -452,7 +452,7 @@
                 <w:b/>
                 <w:sz w:val="25"/>
               </w:rPr>
-              <w:t>03  06  17  23  33</w:t>
+              <w:t>05  10  12  33  39</w:t>
             </w:r>
           </w:p>
         </w:tc>
@@ -481,7 +481,7 @@
                 <w:b/>
                 <w:sz w:val="25"/>
               </w:rPr>
-              <w:t>115000211</w:t>
+              <w:t>115000212</w:t>
             </w:r>
           </w:p>
         </w:tc>
@@ -505,7 +505,7 @@
                 <w:b/>
                 <w:sz w:val="25"/>
               </w:rPr>
-              <w:t>115.08.31</w:t>
+              <w:t>115.09.01</w:t>
             </w:r>
           </w:p>
         </w:tc>
@@ -529,7 +529,7 @@
                 <w:b/>
                 <w:sz w:val="25"/>
               </w:rPr>
-              <w:t>05  10  12  33  39</w:t>
+              <w:t>02  04  22  30  38</w:t>
             </w:r>
           </w:p>
         </w:tc>
@@ -558,7 +558,7 @@
                 <w:b/>
                 <w:sz w:val="25"/>
               </w:rPr>
-              <w:t>115000212</w:t>
+              <w:t>115000213</w:t>
             </w:r>
           </w:p>
         </w:tc>
@@ -582,7 +582,7 @@
                 <w:b/>
                 <w:sz w:val="25"/>
               </w:rPr>
-              <w:t>115.09.01</w:t>
+              <w:t>115.09.02</w:t>
             </w:r>
           </w:p>
         </w:tc>
@@ -606,7 +606,7 @@
                 <w:b/>
                 <w:sz w:val="25"/>
               </w:rPr>
-              <w:t>02  04  22  30  38</w:t>
+              <w:t>07  08  13  16  18</w:t>
             </w:r>
           </w:p>
         </w:tc>
@@ -635,7 +635,7 @@
                 <w:b/>
                 <w:sz w:val="25"/>
               </w:rPr>
-              <w:t>115000213</w:t>
+              <w:t>115000214</w:t>
             </w:r>
           </w:p>
         </w:tc>
@@ -659,7 +659,7 @@
                 <w:b/>
                 <w:sz w:val="25"/>
               </w:rPr>
-              <w:t>115.09.02</w:t>
+              <w:t>115.09.03</w:t>
             </w:r>
           </w:p>
         </w:tc>
@@ -683,7 +683,7 @@
                 <w:b/>
                 <w:sz w:val="25"/>
               </w:rPr>
-              <w:t>07  08  13  16  18</w:t>
+              <w:t>18  19  22  23  34</w:t>
             </w:r>
           </w:p>
         </w:tc>
@@ -712,7 +712,7 @@
                 <w:b/>
                 <w:sz w:val="25"/>
               </w:rPr>
-              <w:t>115000214</w:t>
+              <w:t>115000215</w:t>
             </w:r>
           </w:p>
         </w:tc>
@@ -736,7 +736,7 @@
                 <w:b/>
                 <w:sz w:val="25"/>
               </w:rPr>
-              <w:t>115.09.03</w:t>
+              <w:t>115.09.04</w:t>
             </w:r>
           </w:p>
         </w:tc>
@@ -760,7 +760,7 @@
                 <w:b/>
                 <w:sz w:val="25"/>
               </w:rPr>
-              <w:t>18  19  22  23  34</w:t>
+              <w:t>02  04  15  17  24</w:t>
             </w:r>
           </w:p>
         </w:tc>
@@ -789,7 +789,7 @@
                 <w:b/>
                 <w:sz w:val="25"/>
               </w:rPr>
-              <w:t>115000215</w:t>
+              <w:t>115000216</w:t>
             </w:r>
           </w:p>
         </w:tc>
@@ -813,7 +813,7 @@
                 <w:b/>
                 <w:sz w:val="25"/>
               </w:rPr>
-              <w:t>115.09.04</w:t>
+              <w:t>115.09.05</w:t>
             </w:r>
           </w:p>
         </w:tc>
@@ -837,7 +837,7 @@
                 <w:b/>
                 <w:sz w:val="25"/>
               </w:rPr>
-              <w:t>02  04  15  17  24</w:t>
+              <w:t>03  08  10  28  38</w:t>
             </w:r>
           </w:p>
         </w:tc>
@@ -866,7 +866,7 @@
                 <w:b/>
                 <w:sz w:val="25"/>
               </w:rPr>
-              <w:t>115000216</w:t>
+              <w:t>115000217</w:t>
             </w:r>
           </w:p>
         </w:tc>
@@ -890,7 +890,7 @@
                 <w:b/>
                 <w:sz w:val="25"/>
               </w:rPr>
-              <w:t>115.09.05</w:t>
+              <w:t>115.09.07</w:t>
             </w:r>
           </w:p>
         </w:tc>
@@ -914,7 +914,7 @@
                 <w:b/>
                 <w:sz w:val="25"/>
               </w:rPr>
-              <w:t>03  08  10  28  38</w:t>
+              <w:t>19  25  26  31  35</w:t>
             </w:r>
           </w:p>
         </w:tc>
@@ -1766,7 +1766,7 @@
                 <w:b/>
                 <w:sz w:val="25"/>
               </w:rPr>
-              <w:t>115000062</w:t>
+              <w:t>115000063</w:t>
             </w:r>
           </w:p>
         </w:tc>
@@ -1790,7 +1790,7 @@
                 <w:b/>
                 <w:sz w:val="25"/>
               </w:rPr>
-              <w:t>115.08.03</w:t>
+              <w:t>115.08.06</w:t>
             </w:r>
           </w:p>
         </w:tc>
@@ -1814,7 +1814,7 @@
                 <w:b/>
                 <w:sz w:val="25"/>
               </w:rPr>
-              <w:t>04  15  22  26  34  36</w:t>
+              <w:t>02  07  08  20  26  33</w:t>
             </w:r>
           </w:p>
         </w:tc>
@@ -1838,7 +1838,7 @@
                 <w:b/>
                 <w:sz w:val="25"/>
               </w:rPr>
-              <w:t>07</w:t>
+              <w:t>04</w:t>
             </w:r>
           </w:p>
         </w:tc>
@@ -1867,7 +1867,7 @@
                 <w:b/>
                 <w:sz w:val="25"/>
               </w:rPr>
-              <w:t>115000063</w:t>
+              <w:t>115000064</w:t>
             </w:r>
           </w:p>
         </w:tc>
@@ -1891,7 +1891,7 @@
                 <w:b/>
                 <w:sz w:val="25"/>
               </w:rPr>
-              <w:t>115.08.06</w:t>
+              <w:t>115.08.10</w:t>
             </w:r>
           </w:p>
         </w:tc>
@@ -1915,7 +1915,7 @@
                 <w:b/>
                 <w:sz w:val="25"/>
               </w:rPr>
-              <w:t>02  07  08  20  26  33</w:t>
+              <w:t>11  25  28  30  31  36</w:t>
             </w:r>
           </w:p>
         </w:tc>
@@ -1939,7 +1939,7 @@
                 <w:b/>
                 <w:sz w:val="25"/>
               </w:rPr>
-              <w:t>04</w:t>
+              <w:t>03</w:t>
             </w:r>
           </w:p>
         </w:tc>
@@ -1968,7 +1968,7 @@
                 <w:b/>
                 <w:sz w:val="25"/>
               </w:rPr>
-              <w:t>115000064</w:t>
+              <w:t>115000065</w:t>
             </w:r>
           </w:p>
         </w:tc>
@@ -1992,7 +1992,7 @@
                 <w:b/>
                 <w:sz w:val="25"/>
               </w:rPr>
-              <w:t>115.08.10</w:t>
+              <w:t>115.08.13</w:t>
             </w:r>
           </w:p>
         </w:tc>
@@ -2016,7 +2016,7 @@
                 <w:b/>
                 <w:sz w:val="25"/>
               </w:rPr>
-              <w:t>11  25  28  30  31  36</w:t>
+              <w:t>01  03  04  07  10  19</w:t>
             </w:r>
           </w:p>
         </w:tc>
@@ -2040,7 +2040,7 @@
                 <w:b/>
                 <w:sz w:val="25"/>
               </w:rPr>
-              <w:t>03</w:t>
+              <w:t>06</w:t>
             </w:r>
           </w:p>
         </w:tc>
@@ -2069,7 +2069,7 @@
                 <w:b/>
                 <w:sz w:val="25"/>
               </w:rPr>
-              <w:t>115000065</w:t>
+              <w:t>115000066</w:t>
             </w:r>
           </w:p>
         </w:tc>
@@ -2093,7 +2093,7 @@
                 <w:b/>
                 <w:sz w:val="25"/>
               </w:rPr>
-              <w:t>115.08.13</w:t>
+              <w:t>115.08.17</w:t>
             </w:r>
           </w:p>
         </w:tc>
@@ -2117,7 +2117,7 @@
                 <w:b/>
                 <w:sz w:val="25"/>
               </w:rPr>
-              <w:t>01  03  04  07  10  19</w:t>
+              <w:t>05  11  18  19  35  38</w:t>
             </w:r>
           </w:p>
         </w:tc>
@@ -2141,7 +2141,7 @@
                 <w:b/>
                 <w:sz w:val="25"/>
               </w:rPr>
-              <w:t>06</w:t>
+              <w:t>08</w:t>
             </w:r>
           </w:p>
         </w:tc>
@@ -2170,7 +2170,7 @@
                 <w:b/>
                 <w:sz w:val="25"/>
               </w:rPr>
-              <w:t>115000066</w:t>
+              <w:t>115000067</w:t>
             </w:r>
           </w:p>
         </w:tc>
@@ -2194,7 +2194,7 @@
                 <w:b/>
                 <w:sz w:val="25"/>
               </w:rPr>
-              <w:t>115.08.17</w:t>
+              <w:t>115.08.20</w:t>
             </w:r>
           </w:p>
         </w:tc>
@@ -2218,7 +2218,7 @@
                 <w:b/>
                 <w:sz w:val="25"/>
               </w:rPr>
-              <w:t>05  11  18  19  35  38</w:t>
+              <w:t>01  02  09  11  29  35</w:t>
             </w:r>
           </w:p>
         </w:tc>
@@ -2242,7 +2242,7 @@
                 <w:b/>
                 <w:sz w:val="25"/>
               </w:rPr>
-              <w:t>08</w:t>
+              <w:t>02</w:t>
             </w:r>
           </w:p>
         </w:tc>
@@ -2271,7 +2271,7 @@
                 <w:b/>
                 <w:sz w:val="25"/>
               </w:rPr>
-              <w:t>115000067</w:t>
+              <w:t>115000068</w:t>
             </w:r>
           </w:p>
         </w:tc>
@@ -2295,7 +2295,7 @@
                 <w:b/>
                 <w:sz w:val="25"/>
               </w:rPr>
-              <w:t>115.08.20</w:t>
+              <w:t>115.08.24</w:t>
             </w:r>
           </w:p>
         </w:tc>
@@ -2319,7 +2319,7 @@
                 <w:b/>
                 <w:sz w:val="25"/>
               </w:rPr>
-              <w:t>01  02  09  11  29  35</w:t>
+              <w:t>06  07  09  23  26  36</w:t>
             </w:r>
           </w:p>
         </w:tc>
@@ -2343,7 +2343,7 @@
                 <w:b/>
                 <w:sz w:val="25"/>
               </w:rPr>
-              <w:t>02</w:t>
+              <w:t>07</w:t>
             </w:r>
           </w:p>
         </w:tc>
@@ -2372,7 +2372,7 @@
                 <w:b/>
                 <w:sz w:val="25"/>
               </w:rPr>
-              <w:t>115000068</w:t>
+              <w:t>115000069</w:t>
             </w:r>
           </w:p>
         </w:tc>
@@ -2396,7 +2396,7 @@
                 <w:b/>
                 <w:sz w:val="25"/>
               </w:rPr>
-              <w:t>115.08.24</w:t>
+              <w:t>115.08.27</w:t>
             </w:r>
           </w:p>
         </w:tc>
@@ -2420,7 +2420,7 @@
                 <w:b/>
                 <w:sz w:val="25"/>
               </w:rPr>
-              <w:t>06  07  09  23  26  36</w:t>
+              <w:t>02  07  09  11  24  36</w:t>
             </w:r>
           </w:p>
         </w:tc>
@@ -2444,7 +2444,7 @@
                 <w:b/>
                 <w:sz w:val="25"/>
               </w:rPr>
-              <w:t>07</w:t>
+              <w:t>01</w:t>
             </w:r>
           </w:p>
         </w:tc>
@@ -2473,7 +2473,7 @@
                 <w:b/>
                 <w:sz w:val="25"/>
               </w:rPr>
-              <w:t>115000069</w:t>
+              <w:t>115000070</w:t>
             </w:r>
           </w:p>
         </w:tc>
@@ -2497,7 +2497,7 @@
                 <w:b/>
                 <w:sz w:val="25"/>
               </w:rPr>
-              <w:t>115.08.27</w:t>
+              <w:t>115.08.31</w:t>
             </w:r>
           </w:p>
         </w:tc>
@@ -2521,7 +2521,7 @@
                 <w:b/>
                 <w:sz w:val="25"/>
               </w:rPr>
-              <w:t>02  07  09  11  24  36</w:t>
+              <w:t>04  08  12  19  32  37</w:t>
             </w:r>
           </w:p>
         </w:tc>
@@ -2545,7 +2545,7 @@
                 <w:b/>
                 <w:sz w:val="25"/>
               </w:rPr>
-              <w:t>01</w:t>
+              <w:t>02</w:t>
             </w:r>
           </w:p>
         </w:tc>
@@ -2574,7 +2574,7 @@
                 <w:b/>
                 <w:sz w:val="25"/>
               </w:rPr>
-              <w:t>115000070</w:t>
+              <w:t>115000071</w:t>
             </w:r>
           </w:p>
         </w:tc>
@@ -2598,7 +2598,7 @@
                 <w:b/>
                 <w:sz w:val="25"/>
               </w:rPr>
-              <w:t>115.08.31</w:t>
+              <w:t>115.09.03</w:t>
             </w:r>
           </w:p>
         </w:tc>
@@ -2622,7 +2622,7 @@
                 <w:b/>
                 <w:sz w:val="25"/>
               </w:rPr>
-              <w:t>04  08  12  19  32  37</w:t>
+              <w:t>01  06  07  19  30  33</w:t>
             </w:r>
           </w:p>
         </w:tc>
@@ -2646,7 +2646,7 @@
                 <w:b/>
                 <w:sz w:val="25"/>
               </w:rPr>
-              <w:t>02</w:t>
+              <w:t>08</w:t>
             </w:r>
           </w:p>
         </w:tc>
@@ -2675,7 +2675,7 @@
                 <w:b/>
                 <w:sz w:val="25"/>
               </w:rPr>
-              <w:t>115000071</w:t>
+              <w:t>115000072</w:t>
             </w:r>
           </w:p>
         </w:tc>
@@ -2699,7 +2699,7 @@
                 <w:b/>
                 <w:sz w:val="25"/>
               </w:rPr>
-              <w:t>115.09.03</w:t>
+              <w:t>115.09.07</w:t>
             </w:r>
           </w:p>
         </w:tc>
@@ -2723,7 +2723,7 @@
                 <w:b/>
                 <w:sz w:val="25"/>
               </w:rPr>
-              <w:t>01  06  07  19  30  33</w:t>
+              <w:t>07  14  17  22  29  35</w:t>
             </w:r>
           </w:p>
         </w:tc>
@@ -2747,7 +2747,7 @@
                 <w:b/>
                 <w:sz w:val="25"/>
               </w:rPr>
-              <w:t>08</w:t>
+              <w:t>02</w:t>
             </w:r>
           </w:p>
         </w:tc>

</xml_diff>